<commit_message>
SGS venta: precios v1.1 (control de accesos, tableros, Indice/SLA)
- Planes: tableros (Operacion+Direccion) en base; control de accesos (personas)
  en Profesional+; CEDIS (vehiculos/citas/andenes) como add-on; Indice+SLA+
  reporte mensual en Empresarial.
- Add-ons: Control de accesos CEDIS ($690/sitio/mes) y Tablero ejecutivo
  Indice+SLA ($1,200/mes).
- Ejemplo de cuenta CEDIS; nota de margen (accesos/tableros/SLA = software).
- Comercial e interno a v1.1.

Co-Authored-By: Claude Opus 4.8 <noreply@anthropic.com>
</commit_message>
<xml_diff>
--- a/docs/venta/SGS-Precios-Interno.docx
+++ b/docs/venta/SGS-Precios-Interno.docx
@@ -116,7 +116,7 @@
           <w:sz w:val="20"/>
           <w:szCs w:val="20"/>
         </w:rPr>
-        <w:t xml:space="preserve">Interno v1.0 · Agosto 2026</w:t>
+        <w:t xml:space="preserve">Interno v1.1 · Agosto 2026</w:t>
       </w:r>
     </w:p>
     <w:p>
@@ -812,7 +812,7 @@
                 <w:sz w:val="20"/>
                 <w:szCs w:val="20"/>
               </w:rPr>
-              <w:t xml:space="preserve">Turnos, clientes/sitios, tareas, chat, evidencias, dashboard</w:t>
+              <w:t xml:space="preserve">Turnos, clientes/sitios, tareas, chat, evidencias</w:t>
             </w:r>
           </w:p>
         </w:tc>
@@ -910,7 +910,7 @@
                 <w:sz w:val="20"/>
                 <w:szCs w:val="20"/>
               </w:rPr>
-              <w:t xml:space="preserve">NFC + geocerca (anti-fraude)</w:t>
+              <w:t xml:space="preserve">Tableros (Operación + Dirección)</w:t>
             </w:r>
           </w:p>
         </w:tc>
@@ -934,7 +934,7 @@
                 <w:sz w:val="20"/>
                 <w:szCs w:val="20"/>
               </w:rPr>
-              <w:t xml:space="preserve">—</w:t>
+              <w:t xml:space="preserve">Básico</w:t>
             </w:r>
           </w:p>
         </w:tc>
@@ -1008,7 +1008,7 @@
                 <w:sz w:val="20"/>
                 <w:szCs w:val="20"/>
               </w:rPr>
-              <w:t xml:space="preserve">Monitoreo en vivo multicapa</w:t>
+              <w:t xml:space="preserve">NFC + geocerca (anti-fraude)</w:t>
             </w:r>
           </w:p>
         </w:tc>
@@ -1032,7 +1032,7 @@
                 <w:sz w:val="20"/>
                 <w:szCs w:val="20"/>
               </w:rPr>
-              <w:t xml:space="preserve">Básico</w:t>
+              <w:t xml:space="preserve">—</w:t>
             </w:r>
           </w:p>
         </w:tc>
@@ -1106,7 +1106,7 @@
                 <w:sz w:val="20"/>
                 <w:szCs w:val="20"/>
               </w:rPr>
-              <w:t xml:space="preserve">Supervisión + reporte PDF al cliente</w:t>
+              <w:t xml:space="preserve">Monitoreo en vivo multicapa</w:t>
             </w:r>
           </w:p>
         </w:tc>
@@ -1130,7 +1130,7 @@
                 <w:sz w:val="20"/>
                 <w:szCs w:val="20"/>
               </w:rPr>
-              <w:t xml:space="preserve">—</w:t>
+              <w:t xml:space="preserve">Básico</w:t>
             </w:r>
           </w:p>
         </w:tc>
@@ -1204,7 +1204,7 @@
                 <w:sz w:val="20"/>
                 <w:szCs w:val="20"/>
               </w:rPr>
-              <w:t xml:space="preserve">Alerta de pánico + video en vivo + bodycam</w:t>
+              <w:t xml:space="preserve">Supervisión + reporte PDF al cliente</w:t>
             </w:r>
           </w:p>
         </w:tc>
@@ -1302,7 +1302,7 @@
                 <w:sz w:val="20"/>
                 <w:szCs w:val="20"/>
               </w:rPr>
-              <w:t xml:space="preserve">Videovigilancia (muro de cámaras)</w:t>
+              <w:t xml:space="preserve">Alerta de pánico + video en vivo + bodycam</w:t>
             </w:r>
           </w:p>
         </w:tc>
@@ -1350,7 +1350,7 @@
                 <w:sz w:val="20"/>
                 <w:szCs w:val="20"/>
               </w:rPr>
-              <w:t xml:space="preserve">Add-on</w:t>
+              <w:t xml:space="preserve">✓</w:t>
             </w:r>
           </w:p>
         </w:tc>
@@ -1374,7 +1374,7 @@
                 <w:sz w:val="20"/>
                 <w:szCs w:val="20"/>
               </w:rPr>
-              <w:t xml:space="preserve">✓ (10 incl.)</w:t>
+              <w:t xml:space="preserve">✓</w:t>
             </w:r>
           </w:p>
         </w:tc>
@@ -1400,6 +1400,300 @@
                 <w:sz w:val="20"/>
                 <w:szCs w:val="20"/>
               </w:rPr>
+              <w:t xml:space="preserve">Control de accesos (personas + credenciales)</w:t>
+            </w:r>
+          </w:p>
+        </w:tc>
+        <w:tc>
+          <w:tcPr>
+            <w:tcW w:type="dxa" w:w="2000"/>
+            <w:shd w:fill="FFFFFF" w:color="auto" w:val="clear"/>
+            <w:tcMar>
+              <w:top w:type="dxa" w:w="55"/>
+              <w:left w:type="dxa" w:w="110"/>
+              <w:bottom w:type="dxa" w:w="55"/>
+              <w:right w:type="dxa" w:w="110"/>
+            </w:tcMar>
+          </w:tcPr>
+          <w:p>
+            <w:r>
+              <w:rPr>
+                <w:b w:val="false"/>
+                <w:bCs w:val="false"/>
+                <w:color w:val="222222"/>
+                <w:sz w:val="20"/>
+                <w:szCs w:val="20"/>
+              </w:rPr>
+              <w:t xml:space="preserve">—</w:t>
+            </w:r>
+          </w:p>
+        </w:tc>
+        <w:tc>
+          <w:tcPr>
+            <w:tcW w:type="dxa" w:w="2000"/>
+            <w:shd w:fill="FFFFFF" w:color="auto" w:val="clear"/>
+            <w:tcMar>
+              <w:top w:type="dxa" w:w="55"/>
+              <w:left w:type="dxa" w:w="110"/>
+              <w:bottom w:type="dxa" w:w="55"/>
+              <w:right w:type="dxa" w:w="110"/>
+            </w:tcMar>
+          </w:tcPr>
+          <w:p>
+            <w:r>
+              <w:rPr>
+                <w:b w:val="false"/>
+                <w:bCs w:val="false"/>
+                <w:color w:val="222222"/>
+                <w:sz w:val="20"/>
+                <w:szCs w:val="20"/>
+              </w:rPr>
+              <w:t xml:space="preserve">✓</w:t>
+            </w:r>
+          </w:p>
+        </w:tc>
+        <w:tc>
+          <w:tcPr>
+            <w:tcW w:type="dxa" w:w="2000"/>
+            <w:shd w:fill="FFFFFF" w:color="auto" w:val="clear"/>
+            <w:tcMar>
+              <w:top w:type="dxa" w:w="55"/>
+              <w:left w:type="dxa" w:w="110"/>
+              <w:bottom w:type="dxa" w:w="55"/>
+              <w:right w:type="dxa" w:w="110"/>
+            </w:tcMar>
+          </w:tcPr>
+          <w:p>
+            <w:r>
+              <w:rPr>
+                <w:b w:val="false"/>
+                <w:bCs w:val="false"/>
+                <w:color w:val="222222"/>
+                <w:sz w:val="20"/>
+                <w:szCs w:val="20"/>
+              </w:rPr>
+              <w:t xml:space="preserve">✓</w:t>
+            </w:r>
+          </w:p>
+        </w:tc>
+      </w:tr>
+      <w:tr>
+        <w:tc>
+          <w:tcPr>
+            <w:tcW w:type="dxa" w:w="3360"/>
+            <w:shd w:fill="EEF1F4" w:color="auto" w:val="clear"/>
+            <w:tcMar>
+              <w:top w:type="dxa" w:w="55"/>
+              <w:left w:type="dxa" w:w="110"/>
+              <w:bottom w:type="dxa" w:w="55"/>
+              <w:right w:type="dxa" w:w="110"/>
+            </w:tcMar>
+          </w:tcPr>
+          <w:p>
+            <w:r>
+              <w:rPr>
+                <w:b/>
+                <w:bCs/>
+                <w:color w:val="222222"/>
+                <w:sz w:val="20"/>
+                <w:szCs w:val="20"/>
+              </w:rPr>
+              <w:t xml:space="preserve">Control de accesos CEDIS (vehículos, citas, andenes)</w:t>
+            </w:r>
+          </w:p>
+        </w:tc>
+        <w:tc>
+          <w:tcPr>
+            <w:tcW w:type="dxa" w:w="2000"/>
+            <w:shd w:fill="EEF1F4" w:color="auto" w:val="clear"/>
+            <w:tcMar>
+              <w:top w:type="dxa" w:w="55"/>
+              <w:left w:type="dxa" w:w="110"/>
+              <w:bottom w:type="dxa" w:w="55"/>
+              <w:right w:type="dxa" w:w="110"/>
+            </w:tcMar>
+          </w:tcPr>
+          <w:p>
+            <w:r>
+              <w:rPr>
+                <w:b w:val="false"/>
+                <w:bCs w:val="false"/>
+                <w:color w:val="222222"/>
+                <w:sz w:val="20"/>
+                <w:szCs w:val="20"/>
+              </w:rPr>
+              <w:t xml:space="preserve">—</w:t>
+            </w:r>
+          </w:p>
+        </w:tc>
+        <w:tc>
+          <w:tcPr>
+            <w:tcW w:type="dxa" w:w="2000"/>
+            <w:shd w:fill="EEF1F4" w:color="auto" w:val="clear"/>
+            <w:tcMar>
+              <w:top w:type="dxa" w:w="55"/>
+              <w:left w:type="dxa" w:w="110"/>
+              <w:bottom w:type="dxa" w:w="55"/>
+              <w:right w:type="dxa" w:w="110"/>
+            </w:tcMar>
+          </w:tcPr>
+          <w:p>
+            <w:r>
+              <w:rPr>
+                <w:b w:val="false"/>
+                <w:bCs w:val="false"/>
+                <w:color w:val="222222"/>
+                <w:sz w:val="20"/>
+                <w:szCs w:val="20"/>
+              </w:rPr>
+              <w:t xml:space="preserve">Add-on</w:t>
+            </w:r>
+          </w:p>
+        </w:tc>
+        <w:tc>
+          <w:tcPr>
+            <w:tcW w:type="dxa" w:w="2000"/>
+            <w:shd w:fill="EEF1F4" w:color="auto" w:val="clear"/>
+            <w:tcMar>
+              <w:top w:type="dxa" w:w="55"/>
+              <w:left w:type="dxa" w:w="110"/>
+              <w:bottom w:type="dxa" w:w="55"/>
+              <w:right w:type="dxa" w:w="110"/>
+            </w:tcMar>
+          </w:tcPr>
+          <w:p>
+            <w:r>
+              <w:rPr>
+                <w:b w:val="false"/>
+                <w:bCs w:val="false"/>
+                <w:color w:val="222222"/>
+                <w:sz w:val="20"/>
+                <w:szCs w:val="20"/>
+              </w:rPr>
+              <w:t xml:space="preserve">Add-on</w:t>
+            </w:r>
+          </w:p>
+        </w:tc>
+      </w:tr>
+      <w:tr>
+        <w:tc>
+          <w:tcPr>
+            <w:tcW w:type="dxa" w:w="3360"/>
+            <w:shd w:fill="FFFFFF" w:color="auto" w:val="clear"/>
+            <w:tcMar>
+              <w:top w:type="dxa" w:w="55"/>
+              <w:left w:type="dxa" w:w="110"/>
+              <w:bottom w:type="dxa" w:w="55"/>
+              <w:right w:type="dxa" w:w="110"/>
+            </w:tcMar>
+          </w:tcPr>
+          <w:p>
+            <w:r>
+              <w:rPr>
+                <w:b/>
+                <w:bCs/>
+                <w:color w:val="222222"/>
+                <w:sz w:val="20"/>
+                <w:szCs w:val="20"/>
+              </w:rPr>
+              <w:t xml:space="preserve">Videovigilancia (muro de cámaras)</w:t>
+            </w:r>
+          </w:p>
+        </w:tc>
+        <w:tc>
+          <w:tcPr>
+            <w:tcW w:type="dxa" w:w="2000"/>
+            <w:shd w:fill="FFFFFF" w:color="auto" w:val="clear"/>
+            <w:tcMar>
+              <w:top w:type="dxa" w:w="55"/>
+              <w:left w:type="dxa" w:w="110"/>
+              <w:bottom w:type="dxa" w:w="55"/>
+              <w:right w:type="dxa" w:w="110"/>
+            </w:tcMar>
+          </w:tcPr>
+          <w:p>
+            <w:r>
+              <w:rPr>
+                <w:b w:val="false"/>
+                <w:bCs w:val="false"/>
+                <w:color w:val="222222"/>
+                <w:sz w:val="20"/>
+                <w:szCs w:val="20"/>
+              </w:rPr>
+              <w:t xml:space="preserve">—</w:t>
+            </w:r>
+          </w:p>
+        </w:tc>
+        <w:tc>
+          <w:tcPr>
+            <w:tcW w:type="dxa" w:w="2000"/>
+            <w:shd w:fill="FFFFFF" w:color="auto" w:val="clear"/>
+            <w:tcMar>
+              <w:top w:type="dxa" w:w="55"/>
+              <w:left w:type="dxa" w:w="110"/>
+              <w:bottom w:type="dxa" w:w="55"/>
+              <w:right w:type="dxa" w:w="110"/>
+            </w:tcMar>
+          </w:tcPr>
+          <w:p>
+            <w:r>
+              <w:rPr>
+                <w:b w:val="false"/>
+                <w:bCs w:val="false"/>
+                <w:color w:val="222222"/>
+                <w:sz w:val="20"/>
+                <w:szCs w:val="20"/>
+              </w:rPr>
+              <w:t xml:space="preserve">Add-on</w:t>
+            </w:r>
+          </w:p>
+        </w:tc>
+        <w:tc>
+          <w:tcPr>
+            <w:tcW w:type="dxa" w:w="2000"/>
+            <w:shd w:fill="FFFFFF" w:color="auto" w:val="clear"/>
+            <w:tcMar>
+              <w:top w:type="dxa" w:w="55"/>
+              <w:left w:type="dxa" w:w="110"/>
+              <w:bottom w:type="dxa" w:w="55"/>
+              <w:right w:type="dxa" w:w="110"/>
+            </w:tcMar>
+          </w:tcPr>
+          <w:p>
+            <w:r>
+              <w:rPr>
+                <w:b w:val="false"/>
+                <w:bCs w:val="false"/>
+                <w:color w:val="222222"/>
+                <w:sz w:val="20"/>
+                <w:szCs w:val="20"/>
+              </w:rPr>
+              <w:t xml:space="preserve">✓ (10 incl.)</w:t>
+            </w:r>
+          </w:p>
+        </w:tc>
+      </w:tr>
+      <w:tr>
+        <w:tc>
+          <w:tcPr>
+            <w:tcW w:type="dxa" w:w="3360"/>
+            <w:shd w:fill="EEF1F4" w:color="auto" w:val="clear"/>
+            <w:tcMar>
+              <w:top w:type="dxa" w:w="55"/>
+              <w:left w:type="dxa" w:w="110"/>
+              <w:bottom w:type="dxa" w:w="55"/>
+              <w:right w:type="dxa" w:w="110"/>
+            </w:tcMar>
+          </w:tcPr>
+          <w:p>
+            <w:r>
+              <w:rPr>
+                <w:b/>
+                <w:bCs/>
+                <w:color w:val="222222"/>
+                <w:sz w:val="20"/>
+                <w:szCs w:val="20"/>
+              </w:rPr>
               <w:t xml:space="preserve">Copiloto IA</w:t>
             </w:r>
           </w:p>
@@ -1407,7 +1701,7 @@
         <w:tc>
           <w:tcPr>
             <w:tcW w:type="dxa" w:w="2000"/>
-            <w:shd w:fill="FFFFFF" w:color="auto" w:val="clear"/>
+            <w:shd w:fill="EEF1F4" w:color="auto" w:val="clear"/>
             <w:tcMar>
               <w:top w:type="dxa" w:w="55"/>
               <w:left w:type="dxa" w:w="110"/>
@@ -1431,7 +1725,7 @@
         <w:tc>
           <w:tcPr>
             <w:tcW w:type="dxa" w:w="2000"/>
-            <w:shd w:fill="FFFFFF" w:color="auto" w:val="clear"/>
+            <w:shd w:fill="EEF1F4" w:color="auto" w:val="clear"/>
             <w:tcMar>
               <w:top w:type="dxa" w:w="55"/>
               <w:left w:type="dxa" w:w="110"/>
@@ -1455,7 +1749,7 @@
         <w:tc>
           <w:tcPr>
             <w:tcW w:type="dxa" w:w="2000"/>
-            <w:shd w:fill="FFFFFF" w:color="auto" w:val="clear"/>
+            <w:shd w:fill="EEF1F4" w:color="auto" w:val="clear"/>
             <w:tcMar>
               <w:top w:type="dxa" w:w="55"/>
               <w:left w:type="dxa" w:w="110"/>
@@ -1473,6 +1767,104 @@
                 <w:szCs w:val="20"/>
               </w:rPr>
               <w:t xml:space="preserve">✓ (cupo)</w:t>
+            </w:r>
+          </w:p>
+        </w:tc>
+      </w:tr>
+      <w:tr>
+        <w:tc>
+          <w:tcPr>
+            <w:tcW w:type="dxa" w:w="3360"/>
+            <w:shd w:fill="FFFFFF" w:color="auto" w:val="clear"/>
+            <w:tcMar>
+              <w:top w:type="dxa" w:w="55"/>
+              <w:left w:type="dxa" w:w="110"/>
+              <w:bottom w:type="dxa" w:w="55"/>
+              <w:right w:type="dxa" w:w="110"/>
+            </w:tcMar>
+          </w:tcPr>
+          <w:p>
+            <w:r>
+              <w:rPr>
+                <w:b/>
+                <w:bCs/>
+                <w:color w:val="222222"/>
+                <w:sz w:val="20"/>
+                <w:szCs w:val="20"/>
+              </w:rPr>
+              <w:t xml:space="preserve">Índice de Cumplimiento + SLA + reporte mensual</w:t>
+            </w:r>
+          </w:p>
+        </w:tc>
+        <w:tc>
+          <w:tcPr>
+            <w:tcW w:type="dxa" w:w="2000"/>
+            <w:shd w:fill="FFFFFF" w:color="auto" w:val="clear"/>
+            <w:tcMar>
+              <w:top w:type="dxa" w:w="55"/>
+              <w:left w:type="dxa" w:w="110"/>
+              <w:bottom w:type="dxa" w:w="55"/>
+              <w:right w:type="dxa" w:w="110"/>
+            </w:tcMar>
+          </w:tcPr>
+          <w:p>
+            <w:r>
+              <w:rPr>
+                <w:b w:val="false"/>
+                <w:bCs w:val="false"/>
+                <w:color w:val="222222"/>
+                <w:sz w:val="20"/>
+                <w:szCs w:val="20"/>
+              </w:rPr>
+              <w:t xml:space="preserve">—</w:t>
+            </w:r>
+          </w:p>
+        </w:tc>
+        <w:tc>
+          <w:tcPr>
+            <w:tcW w:type="dxa" w:w="2000"/>
+            <w:shd w:fill="FFFFFF" w:color="auto" w:val="clear"/>
+            <w:tcMar>
+              <w:top w:type="dxa" w:w="55"/>
+              <w:left w:type="dxa" w:w="110"/>
+              <w:bottom w:type="dxa" w:w="55"/>
+              <w:right w:type="dxa" w:w="110"/>
+            </w:tcMar>
+          </w:tcPr>
+          <w:p>
+            <w:r>
+              <w:rPr>
+                <w:b w:val="false"/>
+                <w:bCs w:val="false"/>
+                <w:color w:val="222222"/>
+                <w:sz w:val="20"/>
+                <w:szCs w:val="20"/>
+              </w:rPr>
+              <w:t xml:space="preserve">—</w:t>
+            </w:r>
+          </w:p>
+        </w:tc>
+        <w:tc>
+          <w:tcPr>
+            <w:tcW w:type="dxa" w:w="2000"/>
+            <w:shd w:fill="FFFFFF" w:color="auto" w:val="clear"/>
+            <w:tcMar>
+              <w:top w:type="dxa" w:w="55"/>
+              <w:left w:type="dxa" w:w="110"/>
+              <w:bottom w:type="dxa" w:w="55"/>
+              <w:right w:type="dxa" w:w="110"/>
+            </w:tcMar>
+          </w:tcPr>
+          <w:p>
+            <w:r>
+              <w:rPr>
+                <w:b w:val="false"/>
+                <w:bCs w:val="false"/>
+                <w:color w:val="222222"/>
+                <w:sz w:val="20"/>
+                <w:szCs w:val="20"/>
+              </w:rPr>
+              <w:t xml:space="preserve">✓</w:t>
             </w:r>
           </w:p>
         </w:tc>
@@ -1844,6 +2236,154 @@
                 <w:sz w:val="20"/>
                 <w:szCs w:val="20"/>
               </w:rPr>
+              <w:t xml:space="preserve">Control de accesos CEDIS</w:t>
+            </w:r>
+          </w:p>
+        </w:tc>
+        <w:tc>
+          <w:tcPr>
+            <w:tcW w:type="dxa" w:w="2600"/>
+            <w:shd w:fill="FFFFFF" w:color="auto" w:val="clear"/>
+            <w:tcMar>
+              <w:top w:type="dxa" w:w="55"/>
+              <w:left w:type="dxa" w:w="110"/>
+              <w:bottom w:type="dxa" w:w="55"/>
+              <w:right w:type="dxa" w:w="110"/>
+            </w:tcMar>
+          </w:tcPr>
+          <w:p>
+            <w:r>
+              <w:rPr>
+                <w:b w:val="false"/>
+                <w:bCs w:val="false"/>
+                <w:color w:val="222222"/>
+                <w:sz w:val="20"/>
+                <w:szCs w:val="20"/>
+              </w:rPr>
+              <w:t xml:space="preserve">$690 /sitio/mes</w:t>
+            </w:r>
+          </w:p>
+        </w:tc>
+        <w:tc>
+          <w:tcPr>
+            <w:tcW w:type="dxa" w:w="4160"/>
+            <w:shd w:fill="FFFFFF" w:color="auto" w:val="clear"/>
+            <w:tcMar>
+              <w:top w:type="dxa" w:w="55"/>
+              <w:left w:type="dxa" w:w="110"/>
+              <w:bottom w:type="dxa" w:w="55"/>
+              <w:right w:type="dxa" w:w="110"/>
+            </w:tcMar>
+          </w:tcPr>
+          <w:p>
+            <w:r>
+              <w:rPr>
+                <w:b w:val="false"/>
+                <w:bCs w:val="false"/>
+                <w:color w:val="222222"/>
+                <w:sz w:val="20"/>
+                <w:szCs w:val="20"/>
+              </w:rPr>
+              <w:t xml:space="preserve">Citas, andenes, vehículos y zonas (además del acceso de personas, ya incluido en Profesional+).</w:t>
+            </w:r>
+          </w:p>
+        </w:tc>
+      </w:tr>
+      <w:tr>
+        <w:tc>
+          <w:tcPr>
+            <w:tcW w:type="dxa" w:w="2600"/>
+            <w:shd w:fill="EEF1F4" w:color="auto" w:val="clear"/>
+            <w:tcMar>
+              <w:top w:type="dxa" w:w="55"/>
+              <w:left w:type="dxa" w:w="110"/>
+              <w:bottom w:type="dxa" w:w="55"/>
+              <w:right w:type="dxa" w:w="110"/>
+            </w:tcMar>
+          </w:tcPr>
+          <w:p>
+            <w:r>
+              <w:rPr>
+                <w:b/>
+                <w:bCs/>
+                <w:color w:val="222222"/>
+                <w:sz w:val="20"/>
+                <w:szCs w:val="20"/>
+              </w:rPr>
+              <w:t xml:space="preserve">Tablero ejecutivo (Índice + SLA)</w:t>
+            </w:r>
+          </w:p>
+        </w:tc>
+        <w:tc>
+          <w:tcPr>
+            <w:tcW w:type="dxa" w:w="2600"/>
+            <w:shd w:fill="EEF1F4" w:color="auto" w:val="clear"/>
+            <w:tcMar>
+              <w:top w:type="dxa" w:w="55"/>
+              <w:left w:type="dxa" w:w="110"/>
+              <w:bottom w:type="dxa" w:w="55"/>
+              <w:right w:type="dxa" w:w="110"/>
+            </w:tcMar>
+          </w:tcPr>
+          <w:p>
+            <w:r>
+              <w:rPr>
+                <w:b w:val="false"/>
+                <w:bCs w:val="false"/>
+                <w:color w:val="222222"/>
+                <w:sz w:val="20"/>
+                <w:szCs w:val="20"/>
+              </w:rPr>
+              <w:t xml:space="preserve">$1,200 /mes</w:t>
+            </w:r>
+          </w:p>
+        </w:tc>
+        <w:tc>
+          <w:tcPr>
+            <w:tcW w:type="dxa" w:w="4160"/>
+            <w:shd w:fill="EEF1F4" w:color="auto" w:val="clear"/>
+            <w:tcMar>
+              <w:top w:type="dxa" w:w="55"/>
+              <w:left w:type="dxa" w:w="110"/>
+              <w:bottom w:type="dxa" w:w="55"/>
+              <w:right w:type="dxa" w:w="110"/>
+            </w:tcMar>
+          </w:tcPr>
+          <w:p>
+            <w:r>
+              <w:rPr>
+                <w:b w:val="false"/>
+                <w:bCs w:val="false"/>
+                <w:color w:val="222222"/>
+                <w:sz w:val="20"/>
+                <w:szCs w:val="20"/>
+              </w:rPr>
+              <w:t xml:space="preserve">Reporte mensual de cumplimiento por cliente; incluido en Empresarial.</w:t>
+            </w:r>
+          </w:p>
+        </w:tc>
+      </w:tr>
+      <w:tr>
+        <w:tc>
+          <w:tcPr>
+            <w:tcW w:type="dxa" w:w="2600"/>
+            <w:shd w:fill="FFFFFF" w:color="auto" w:val="clear"/>
+            <w:tcMar>
+              <w:top w:type="dxa" w:w="55"/>
+              <w:left w:type="dxa" w:w="110"/>
+              <w:bottom w:type="dxa" w:w="55"/>
+              <w:right w:type="dxa" w:w="110"/>
+            </w:tcMar>
+          </w:tcPr>
+          <w:p>
+            <w:r>
+              <w:rPr>
+                <w:b/>
+                <w:bCs/>
+                <w:color w:val="222222"/>
+                <w:sz w:val="20"/>
+                <w:szCs w:val="20"/>
+              </w:rPr>
               <w:t xml:space="preserve">Videovigilancia</w:t>
             </w:r>
           </w:p>
@@ -3692,6 +4232,80 @@
                 <w:sz w:val="20"/>
                 <w:szCs w:val="20"/>
               </w:rPr>
+              <w:t xml:space="preserve">CEDIS — 60 guardias, Profesional + accesos CEDIS (2 sitios)</w:t>
+            </w:r>
+          </w:p>
+        </w:tc>
+        <w:tc>
+          <w:tcPr>
+            <w:tcW w:type="dxa" w:w="3000"/>
+            <w:shd w:fill="FFFFFF" w:color="auto" w:val="clear"/>
+            <w:tcMar>
+              <w:top w:type="dxa" w:w="55"/>
+              <w:left w:type="dxa" w:w="110"/>
+              <w:bottom w:type="dxa" w:w="55"/>
+              <w:right w:type="dxa" w:w="110"/>
+            </w:tcMar>
+          </w:tcPr>
+          <w:p>
+            <w:r>
+              <w:rPr>
+                <w:b w:val="false"/>
+                <w:bCs w:val="false"/>
+                <w:color w:val="222222"/>
+                <w:sz w:val="20"/>
+                <w:szCs w:val="20"/>
+              </w:rPr>
+              <w:t xml:space="preserve">60 × $159 + 2 × $690</w:t>
+            </w:r>
+          </w:p>
+        </w:tc>
+        <w:tc>
+          <w:tcPr>
+            <w:tcW w:type="dxa" w:w="2000"/>
+            <w:shd w:fill="FFFFFF" w:color="auto" w:val="clear"/>
+            <w:tcMar>
+              <w:top w:type="dxa" w:w="55"/>
+              <w:left w:type="dxa" w:w="110"/>
+              <w:bottom w:type="dxa" w:w="55"/>
+              <w:right w:type="dxa" w:w="110"/>
+            </w:tcMar>
+          </w:tcPr>
+          <w:p>
+            <w:r>
+              <w:rPr>
+                <w:b w:val="false"/>
+                <w:bCs w:val="false"/>
+                <w:color w:val="222222"/>
+                <w:sz w:val="20"/>
+                <w:szCs w:val="20"/>
+              </w:rPr>
+              <w:t xml:space="preserve">$10,920</w:t>
+            </w:r>
+          </w:p>
+        </w:tc>
+      </w:tr>
+      <w:tr>
+        <w:tc>
+          <w:tcPr>
+            <w:tcW w:type="dxa" w:w="4360"/>
+            <w:shd w:fill="EEF1F4" w:color="auto" w:val="clear"/>
+            <w:tcMar>
+              <w:top w:type="dxa" w:w="55"/>
+              <w:left w:type="dxa" w:w="110"/>
+              <w:bottom w:type="dxa" w:w="55"/>
+              <w:right w:type="dxa" w:w="110"/>
+            </w:tcMar>
+          </w:tcPr>
+          <w:p>
+            <w:r>
+              <w:rPr>
+                <w:b/>
+                <w:bCs/>
+                <w:color w:val="222222"/>
+                <w:sz w:val="20"/>
+                <w:szCs w:val="20"/>
+              </w:rPr>
               <w:t xml:space="preserve">Grande — 400 guardias, Empresarial</w:t>
             </w:r>
           </w:p>
@@ -3699,7 +4313,7 @@
         <w:tc>
           <w:tcPr>
             <w:tcW w:type="dxa" w:w="3000"/>
-            <w:shd w:fill="FFFFFF" w:color="auto" w:val="clear"/>
+            <w:shd w:fill="EEF1F4" w:color="auto" w:val="clear"/>
             <w:tcMar>
               <w:top w:type="dxa" w:w="55"/>
               <w:left w:type="dxa" w:w="110"/>
@@ -3723,7 +4337,7 @@
         <w:tc>
           <w:tcPr>
             <w:tcW w:type="dxa" w:w="2000"/>
-            <w:shd w:fill="FFFFFF" w:color="auto" w:val="clear"/>
+            <w:shd w:fill="EEF1F4" w:color="auto" w:val="clear"/>
             <w:tcMar>
               <w:top w:type="dxa" w:w="55"/>
               <w:left w:type="dxa" w:w="110"/>
@@ -4867,6 +5481,34 @@
           <w:sz w:val="21"/>
           <w:szCs w:val="21"/>
         </w:rPr>
+        <w:t xml:space="preserve">Control de accesos, tableros e Índice/SLA = software: </w:t>
+      </w:r>
+      <w:r>
+        <w:rPr>
+          <w:color w:val="222222"/>
+          <w:sz w:val="21"/>
+          <w:szCs w:val="21"/>
+        </w:rPr>
+        <w:t xml:space="preserve">costo variable casi nulo (datos), margen alto; el add-on CEDIS ($/sitio) y el tablero ejecutivo suben el ticket sin costo de terceros.</w:t>
+      </w:r>
+    </w:p>
+    <w:p>
+      <w:pPr>
+        <w:pStyle w:val="ListParagraph"/>
+        <w:numPr>
+          <w:ilvl w:val="0"/>
+          <w:numId w:val="2"/>
+        </w:numPr>
+        <w:spacing w:after="70" w:line="270"/>
+      </w:pPr>
+      <w:r>
+        <w:rPr>
+          <w:b/>
+          <w:bCs/>
+          <w:color w:val="222222"/>
+          <w:sz w:val="21"/>
+          <w:szCs w:val="21"/>
+        </w:rPr>
         <w:t xml:space="preserve">Video, almacenamiento, IA y cámaras = costo variable real: </w:t>
       </w:r>
       <w:r>
@@ -5169,7 +5811,7 @@
           <w:sz w:val="16"/>
           <w:szCs w:val="16"/>
         </w:rPr>
-        <w:t xml:space="preserve">SGS — Sistema de Gestión de Seguridad · Precios (uso interno) · Interno v1.0 · Agosto 2026</w:t>
+        <w:t xml:space="preserve">SGS — Sistema de Gestión de Seguridad · Precios (uso interno) · Interno v1.1 · Agosto 2026</w:t>
       </w:r>
     </w:p>
     <w:sectPr>

</xml_diff>